<commit_message>
SOLO: label Year A/B on every content point; set new banding rule
Audit (Units 29–36) showed pure cognitive-demand banding misaligned with the
NESA A/B content groups both ways (A-in-Yellow, B-in-Red), because A/B is
curriculum progression (≈Y5 vs Y6), not difficulty.

Policy change (Nicholas, 2026-06-20), encoded in SOLO_PIPELINE_SPEC.md §0b +
PROMPTS.md: keep cognitive-demand banding BUT every Year A content point goes in
Red (never Yellow); Year B may be Red (if simple) or Yellow (if applying).
Read A/B from the DoE "Outcomes and content" grid, not from difficulty.

Programs (Deliverable B) for all 8 units retrofitted: each Page-2 Outcome
Teaching Record content point now states its Year A / Year B group (Stage 4
group A for Green). Bands/colours left unchanged per Nicholas. Corrected 5
mislabels found by the audit (u35 R2 RN-A, Y1/Y2/Y5 AR-A; u34 R3 = mass NSM-A /
length GM-B). docx + PDF rebuilt; 0 blank pages.

Co-Authored-By: Claude Opus 4.8 <noreply@anthropic.com>
</commit_message>
<xml_diff>
--- a/units/u29/Maths_S3_YearB_Unit29_SOLO_Full_Program.docx
+++ b/units/u29/Maths_S3_YearB_Unit29_SOLO_Full_Program.docx
@@ -2874,6 +2874,20 @@
               <w:t xml:space="preserve">MA3-3DS-01</w:t>
             </w:r>
           </w:p>
+          <w:p>
+            <w:pPr>
+              <w:spacing w:before="20" w:after="0"/>
+            </w:pPr>
+            <w:r>
+              <w:rPr>
+                <w:color w:val="444444"/>
+                <w:sz w:val="13"/>
+                <w:szCs w:val="13"/>
+                <w:rFonts w:ascii="Arial" w:cs="Arial" w:eastAsia="Arial" w:hAnsi="Arial"/>
+              </w:rPr>
+              <w:t xml:space="preserve">Year A</w:t>
+            </w:r>
+          </w:p>
         </w:tc>
         <w:tc>
           <w:tcPr>
@@ -3104,6 +3118,20 @@
               <w:t xml:space="preserve">MA3-3DS-01</w:t>
             </w:r>
           </w:p>
+          <w:p>
+            <w:pPr>
+              <w:spacing w:before="20" w:after="0"/>
+            </w:pPr>
+            <w:r>
+              <w:rPr>
+                <w:color w:val="444444"/>
+                <w:sz w:val="13"/>
+                <w:szCs w:val="13"/>
+                <w:rFonts w:ascii="Arial" w:cs="Arial" w:eastAsia="Arial" w:hAnsi="Arial"/>
+              </w:rPr>
+              <w:t xml:space="preserve">Year A</w:t>
+            </w:r>
+          </w:p>
         </w:tc>
         <w:tc>
           <w:tcPr>
@@ -3334,6 +3362,20 @@
               <w:t xml:space="preserve">MA3-RN-02</w:t>
             </w:r>
           </w:p>
+          <w:p>
+            <w:pPr>
+              <w:spacing w:before="20" w:after="0"/>
+            </w:pPr>
+            <w:r>
+              <w:rPr>
+                <w:color w:val="444444"/>
+                <w:sz w:val="13"/>
+                <w:szCs w:val="13"/>
+                <w:rFonts w:ascii="Arial" w:cs="Arial" w:eastAsia="Arial" w:hAnsi="Arial"/>
+              </w:rPr>
+              <w:t xml:space="preserve">Year A</w:t>
+            </w:r>
+          </w:p>
         </w:tc>
         <w:tc>
           <w:tcPr>
@@ -3563,6 +3605,20 @@
               <w:t xml:space="preserve">MA3-3DS-02</w:t>
             </w:r>
           </w:p>
+          <w:p>
+            <w:pPr>
+              <w:spacing w:before="20" w:after="0"/>
+            </w:pPr>
+            <w:r>
+              <w:rPr>
+                <w:color w:val="444444"/>
+                <w:sz w:val="13"/>
+                <w:szCs w:val="13"/>
+                <w:rFonts w:ascii="Arial" w:cs="Arial" w:eastAsia="Arial" w:hAnsi="Arial"/>
+              </w:rPr>
+              <w:t xml:space="preserve">Year A</w:t>
+            </w:r>
+          </w:p>
         </w:tc>
         <w:tc>
           <w:tcPr>
@@ -3792,6 +3848,20 @@
               <w:t xml:space="preserve">MA3-3DS-01</w:t>
             </w:r>
           </w:p>
+          <w:p>
+            <w:pPr>
+              <w:spacing w:before="20" w:after="0"/>
+            </w:pPr>
+            <w:r>
+              <w:rPr>
+                <w:color w:val="444444"/>
+                <w:sz w:val="13"/>
+                <w:szCs w:val="13"/>
+                <w:rFonts w:ascii="Arial" w:cs="Arial" w:eastAsia="Arial" w:hAnsi="Arial"/>
+              </w:rPr>
+              <w:t xml:space="preserve">Year A</w:t>
+            </w:r>
+          </w:p>
         </w:tc>
         <w:tc>
           <w:tcPr>
@@ -4021,6 +4091,20 @@
               <w:t xml:space="preserve">MA3-3DS-01</w:t>
             </w:r>
           </w:p>
+          <w:p>
+            <w:pPr>
+              <w:spacing w:before="20" w:after="0"/>
+            </w:pPr>
+            <w:r>
+              <w:rPr>
+                <w:color w:val="444444"/>
+                <w:sz w:val="13"/>
+                <w:szCs w:val="13"/>
+                <w:rFonts w:ascii="Arial" w:cs="Arial" w:eastAsia="Arial" w:hAnsi="Arial"/>
+              </w:rPr>
+              <w:t xml:space="preserve">Year A</w:t>
+            </w:r>
+          </w:p>
         </w:tc>
         <w:tc>
           <w:tcPr>
@@ -4251,6 +4335,20 @@
               <w:t xml:space="preserve">MA3-3DS-01</w:t>
             </w:r>
           </w:p>
+          <w:p>
+            <w:pPr>
+              <w:spacing w:before="20" w:after="0"/>
+            </w:pPr>
+            <w:r>
+              <w:rPr>
+                <w:color w:val="444444"/>
+                <w:sz w:val="13"/>
+                <w:szCs w:val="13"/>
+                <w:rFonts w:ascii="Arial" w:cs="Arial" w:eastAsia="Arial" w:hAnsi="Arial"/>
+              </w:rPr>
+              <w:t xml:space="preserve">Year B</w:t>
+            </w:r>
+          </w:p>
         </w:tc>
         <w:tc>
           <w:tcPr>
@@ -4480,6 +4578,20 @@
               <w:t xml:space="preserve">MA3-3DS-02</w:t>
             </w:r>
           </w:p>
+          <w:p>
+            <w:pPr>
+              <w:spacing w:before="20" w:after="0"/>
+            </w:pPr>
+            <w:r>
+              <w:rPr>
+                <w:color w:val="444444"/>
+                <w:sz w:val="13"/>
+                <w:szCs w:val="13"/>
+                <w:rFonts w:ascii="Arial" w:cs="Arial" w:eastAsia="Arial" w:hAnsi="Arial"/>
+              </w:rPr>
+              <w:t xml:space="preserve">Year A</w:t>
+            </w:r>
+          </w:p>
         </w:tc>
         <w:tc>
           <w:tcPr>
@@ -4709,6 +4821,20 @@
               <w:t xml:space="preserve">MA3-3DS-02</w:t>
             </w:r>
           </w:p>
+          <w:p>
+            <w:pPr>
+              <w:spacing w:before="20" w:after="0"/>
+            </w:pPr>
+            <w:r>
+              <w:rPr>
+                <w:color w:val="444444"/>
+                <w:sz w:val="13"/>
+                <w:szCs w:val="13"/>
+                <w:rFonts w:ascii="Arial" w:cs="Arial" w:eastAsia="Arial" w:hAnsi="Arial"/>
+              </w:rPr>
+              <w:t xml:space="preserve">Year A</w:t>
+            </w:r>
+          </w:p>
         </w:tc>
         <w:tc>
           <w:tcPr>
@@ -4938,6 +5064,20 @@
               <w:t xml:space="preserve">MA3-3DS-02</w:t>
             </w:r>
           </w:p>
+          <w:p>
+            <w:pPr>
+              <w:spacing w:before="20" w:after="0"/>
+            </w:pPr>
+            <w:r>
+              <w:rPr>
+                <w:color w:val="444444"/>
+                <w:sz w:val="13"/>
+                <w:szCs w:val="13"/>
+                <w:rFonts w:ascii="Arial" w:cs="Arial" w:eastAsia="Arial" w:hAnsi="Arial"/>
+              </w:rPr>
+              <w:t xml:space="preserve">Year A</w:t>
+            </w:r>
+          </w:p>
         </w:tc>
         <w:tc>
           <w:tcPr>
@@ -5167,6 +5307,20 @@
               <w:t xml:space="preserve">MA4-VOL-C-01</w:t>
             </w:r>
           </w:p>
+          <w:p>
+            <w:pPr>
+              <w:spacing w:before="20" w:after="0"/>
+            </w:pPr>
+            <w:r>
+              <w:rPr>
+                <w:color w:val="444444"/>
+                <w:sz w:val="13"/>
+                <w:szCs w:val="13"/>
+                <w:rFonts w:ascii="Arial" w:cs="Arial" w:eastAsia="Arial" w:hAnsi="Arial"/>
+              </w:rPr>
+              <w:t xml:space="preserve">Stage 4 (group A)</w:t>
+            </w:r>
+          </w:p>
         </w:tc>
         <w:tc>
           <w:tcPr>
@@ -5396,6 +5550,20 @@
               <w:t xml:space="preserve">MA4-VOL-C-01</w:t>
             </w:r>
           </w:p>
+          <w:p>
+            <w:pPr>
+              <w:spacing w:before="20" w:after="0"/>
+            </w:pPr>
+            <w:r>
+              <w:rPr>
+                <w:color w:val="444444"/>
+                <w:sz w:val="13"/>
+                <w:szCs w:val="13"/>
+                <w:rFonts w:ascii="Arial" w:cs="Arial" w:eastAsia="Arial" w:hAnsi="Arial"/>
+              </w:rPr>
+              <w:t xml:space="preserve">Stage 4 (group A)</w:t>
+            </w:r>
+          </w:p>
         </w:tc>
         <w:tc>
           <w:tcPr>
@@ -5623,6 +5791,20 @@
                 <w:rFonts w:ascii="Arial" w:cs="Arial" w:eastAsia="Arial" w:hAnsi="Arial"/>
               </w:rPr>
               <w:t xml:space="preserve">MA4-VOL-C-01</w:t>
+            </w:r>
+          </w:p>
+          <w:p>
+            <w:pPr>
+              <w:spacing w:before="20" w:after="0"/>
+            </w:pPr>
+            <w:r>
+              <w:rPr>
+                <w:color w:val="444444"/>
+                <w:sz w:val="13"/>
+                <w:szCs w:val="13"/>
+                <w:rFonts w:ascii="Arial" w:cs="Arial" w:eastAsia="Arial" w:hAnsi="Arial"/>
+              </w:rPr>
+              <w:t xml:space="preserve">Stage 4 (group A)</w:t>
             </w:r>
           </w:p>
         </w:tc>
@@ -19909,7 +20091,7 @@
             <w:pPr>
               <w:spacing w:before="0" w:after="0"/>
             </w:pPr>
-            <w:hyperlink w:history="1" r:id="rIdg-l3lc6t5bvolo_almpgk">
+            <w:hyperlink w:history="1" r:id="rId1ijdlgrggn5hztrhnemib">
               <w:r>
                 <w:rPr>
                   <w:u w:val="single"/>
@@ -20026,7 +20208,7 @@
             <w:pPr>
               <w:spacing w:before="0" w:after="0"/>
             </w:pPr>
-            <w:hyperlink w:history="1" r:id="rIdnvvq593xyho6oz99e1mpq">
+            <w:hyperlink w:history="1" r:id="rIdfjuuqbhqn9xwgxnmrgruk">
               <w:r>
                 <w:rPr>
                   <w:u w:val="single"/>
@@ -20143,7 +20325,7 @@
             <w:pPr>
               <w:spacing w:before="0" w:after="0"/>
             </w:pPr>
-            <w:hyperlink w:history="1" r:id="rIdxudodivzton6uimhfy9jn">
+            <w:hyperlink w:history="1" r:id="rIdh6ns76tjcdal9jt40rz65">
               <w:r>
                 <w:rPr>
                   <w:u w:val="single"/>
@@ -20260,7 +20442,7 @@
             <w:pPr>
               <w:spacing w:before="0" w:after="0"/>
             </w:pPr>
-            <w:hyperlink w:history="1" r:id="rIdsp1i2gqw7usaixs4kczwy">
+            <w:hyperlink w:history="1" r:id="rIddloip8hm2ohqji-skf-pe">
               <w:r>
                 <w:rPr>
                   <w:u w:val="single"/>
@@ -20417,7 +20599,7 @@
             <w:pPr>
               <w:spacing w:before="0" w:after="0"/>
             </w:pPr>
-            <w:hyperlink w:history="1" r:id="rIdeqxrkszpiemdlejruiblm">
+            <w:hyperlink w:history="1" r:id="rIdcplwhyuhzbw3mtvwx9lo6">
               <w:r>
                 <w:rPr>
                   <w:u w:val="single"/>
@@ -20534,7 +20716,7 @@
             <w:pPr>
               <w:spacing w:before="0" w:after="0"/>
             </w:pPr>
-            <w:hyperlink w:history="1" r:id="rId23nfopdnqo5nqs6qx41wb">
+            <w:hyperlink w:history="1" r:id="rIdc5h5v37luyzfccb2n15ez">
               <w:r>
                 <w:rPr>
                   <w:u w:val="single"/>
@@ -20651,7 +20833,7 @@
             <w:pPr>
               <w:spacing w:before="0" w:after="0"/>
             </w:pPr>
-            <w:hyperlink w:history="1" r:id="rIdxffxw3zua3zkbncakvtk1">
+            <w:hyperlink w:history="1" r:id="rIdjnl-mftivuc1votzxy1il">
               <w:r>
                 <w:rPr>
                   <w:u w:val="single"/>
@@ -20768,7 +20950,7 @@
             <w:pPr>
               <w:spacing w:before="0" w:after="0"/>
             </w:pPr>
-            <w:hyperlink w:history="1" r:id="rId5bh_fk75s7mqhs6i0zkwl">
+            <w:hyperlink w:history="1" r:id="rIdrhxlgoz8v68_76d0bbj07">
               <w:r>
                 <w:rPr>
                   <w:u w:val="single"/>
@@ -20925,7 +21107,7 @@
             <w:pPr>
               <w:spacing w:before="0" w:after="0"/>
             </w:pPr>
-            <w:hyperlink w:history="1" r:id="rIdztpyoevetxujwg5a2gk7v">
+            <w:hyperlink w:history="1" r:id="rIddngqn31o09ypruidp2pvc">
               <w:r>
                 <w:rPr>
                   <w:u w:val="single"/>
@@ -21042,7 +21224,7 @@
             <w:pPr>
               <w:spacing w:before="0" w:after="0"/>
             </w:pPr>
-            <w:hyperlink w:history="1" r:id="rIdtx-9toryd4r_ibb79bswx">
+            <w:hyperlink w:history="1" r:id="rIdkkjilyqxmpiflzsmbgnxk">
               <w:r>
                 <w:rPr>
                   <w:u w:val="single"/>
@@ -21159,7 +21341,7 @@
             <w:pPr>
               <w:spacing w:before="0" w:after="0"/>
             </w:pPr>
-            <w:hyperlink w:history="1" r:id="rIdoob31syrqccjygbcvqlcn">
+            <w:hyperlink w:history="1" r:id="rIdmlbpvze2hthf_qxdovily">
               <w:r>
                 <w:rPr>
                   <w:u w:val="single"/>
@@ -21276,7 +21458,7 @@
             <w:pPr>
               <w:spacing w:before="0" w:after="0"/>
             </w:pPr>
-            <w:hyperlink w:history="1" r:id="rId3anulufxffmbezexxuvwm">
+            <w:hyperlink w:history="1" r:id="rIdly32fi1vp7arbfbfalicq">
               <w:r>
                 <w:rPr>
                   <w:u w:val="single"/>
@@ -21433,7 +21615,7 @@
             <w:pPr>
               <w:spacing w:before="0" w:after="0"/>
             </w:pPr>
-            <w:hyperlink w:history="1" r:id="rId4wfjtkxepumhj7xjsn1ym">
+            <w:hyperlink w:history="1" r:id="rIdxij_3zfl6tzzz7qadhpo0">
               <w:r>
                 <w:rPr>
                   <w:u w:val="single"/>
@@ -21550,7 +21732,7 @@
             <w:pPr>
               <w:spacing w:before="0" w:after="0"/>
             </w:pPr>
-            <w:hyperlink w:history="1" r:id="rIdlhhqhhnsrzoctid0j0s-j">
+            <w:hyperlink w:history="1" r:id="rIdw12bbyjhbeth4qs8vfeez">
               <w:r>
                 <w:rPr>
                   <w:u w:val="single"/>
@@ -21667,7 +21849,7 @@
             <w:pPr>
               <w:spacing w:before="0" w:after="0"/>
             </w:pPr>
-            <w:hyperlink w:history="1" r:id="rId2mfjy4iie-5llt4pifhlb">
+            <w:hyperlink w:history="1" r:id="rIdvmzswxcevehbhmd7n8bmd">
               <w:r>
                 <w:rPr>
                   <w:u w:val="single"/>
@@ -21824,7 +22006,7 @@
             <w:pPr>
               <w:spacing w:before="0" w:after="0"/>
             </w:pPr>
-            <w:hyperlink w:history="1" r:id="rIdsum10cgqnjhyfb6-uqf3t">
+            <w:hyperlink w:history="1" r:id="rIdjisewkppqiimnobjgvopm">
               <w:r>
                 <w:rPr>
                   <w:u w:val="single"/>
@@ -21941,7 +22123,7 @@
             <w:pPr>
               <w:spacing w:before="0" w:after="0"/>
             </w:pPr>
-            <w:hyperlink w:history="1" r:id="rIdcoxvvndm6no4gbjxa962f">
+            <w:hyperlink w:history="1" r:id="rIdbwirlkceprjlmxu-75wtt">
               <w:r>
                 <w:rPr>
                   <w:u w:val="single"/>
@@ -22058,7 +22240,7 @@
             <w:pPr>
               <w:spacing w:before="0" w:after="0"/>
             </w:pPr>
-            <w:hyperlink w:history="1" r:id="rIdjqqqenn7otvf2aw7vuwzt">
+            <w:hyperlink w:history="1" r:id="rIdly0hmvv0uoahibfdry69z">
               <w:r>
                 <w:rPr>
                   <w:u w:val="single"/>
@@ -22215,7 +22397,7 @@
             <w:pPr>
               <w:spacing w:before="0" w:after="0"/>
             </w:pPr>
-            <w:hyperlink w:history="1" r:id="rIdezxddkeso0lyv0m32ukzj">
+            <w:hyperlink w:history="1" r:id="rIdzlah9a6txrw2isdqn__qd">
               <w:r>
                 <w:rPr>
                   <w:u w:val="single"/>
@@ -22332,7 +22514,7 @@
             <w:pPr>
               <w:spacing w:before="0" w:after="0"/>
             </w:pPr>
-            <w:hyperlink w:history="1" r:id="rIdz1fkqrnzeo0ubvjyavuy3">
+            <w:hyperlink w:history="1" r:id="rIdeyhctakgg1fibyzklnmdn">
               <w:r>
                 <w:rPr>
                   <w:u w:val="single"/>
@@ -22449,7 +22631,7 @@
             <w:pPr>
               <w:spacing w:before="0" w:after="0"/>
             </w:pPr>
-            <w:hyperlink w:history="1" r:id="rIdt7b2cs6d3bemeg3tr8qye">
+            <w:hyperlink w:history="1" r:id="rId1zp6a6x5qhkgf9x9fdhba">
               <w:r>
                 <w:rPr>
                   <w:u w:val="single"/>
@@ -22606,7 +22788,7 @@
             <w:pPr>
               <w:spacing w:before="0" w:after="0"/>
             </w:pPr>
-            <w:hyperlink w:history="1" r:id="rIddjn05ijg8s_b20uu6sjnd">
+            <w:hyperlink w:history="1" r:id="rIdalw2as1gp1wtwr0lqpekw">
               <w:r>
                 <w:rPr>
                   <w:u w:val="single"/>
@@ -22723,7 +22905,7 @@
             <w:pPr>
               <w:spacing w:before="0" w:after="0"/>
             </w:pPr>
-            <w:hyperlink w:history="1" r:id="rIdblpvbltkfmmktl976jla2">
+            <w:hyperlink w:history="1" r:id="rIdwg6x4hc1leoyueyg3rwmv">
               <w:r>
                 <w:rPr>
                   <w:u w:val="single"/>
@@ -22840,7 +23022,7 @@
             <w:pPr>
               <w:spacing w:before="0" w:after="0"/>
             </w:pPr>
-            <w:hyperlink w:history="1" r:id="rIdwndmcgky0uac06x-qzwjg">
+            <w:hyperlink w:history="1" r:id="rIdnixccqueweynpwjz0lgqf">
               <w:r>
                 <w:rPr>
                   <w:u w:val="single"/>
@@ -22997,7 +23179,7 @@
             <w:pPr>
               <w:spacing w:before="0" w:after="0"/>
             </w:pPr>
-            <w:hyperlink w:history="1" r:id="rIdjpw-jyfgwcwxyytkvnrxl">
+            <w:hyperlink w:history="1" r:id="rIddjwddmq0sh5nwevdrqsot">
               <w:r>
                 <w:rPr>
                   <w:u w:val="single"/>
@@ -23114,7 +23296,7 @@
             <w:pPr>
               <w:spacing w:before="0" w:after="0"/>
             </w:pPr>
-            <w:hyperlink w:history="1" r:id="rId8sb1p2g2oworx2gi3fdob">
+            <w:hyperlink w:history="1" r:id="rIdqdil0xt2pij3mtymdi_7b">
               <w:r>
                 <w:rPr>
                   <w:u w:val="single"/>
@@ -23231,7 +23413,7 @@
             <w:pPr>
               <w:spacing w:before="0" w:after="0"/>
             </w:pPr>
-            <w:hyperlink w:history="1" r:id="rIdu7wa1lfrjgtysn4nhz5te">
+            <w:hyperlink w:history="1" r:id="rIdpwvicyv9uyeoang0rqj-d">
               <w:r>
                 <w:rPr>
                   <w:u w:val="single"/>
@@ -23348,7 +23530,7 @@
             <w:pPr>
               <w:spacing w:before="0" w:after="0"/>
             </w:pPr>
-            <w:hyperlink w:history="1" r:id="rId6kpwt6puyxzi75jiftpkp">
+            <w:hyperlink w:history="1" r:id="rIdm5xpoi2t6s30ikj7ysm6z">
               <w:r>
                 <w:rPr>
                   <w:u w:val="single"/>
@@ -23505,7 +23687,7 @@
             <w:pPr>
               <w:spacing w:before="0" w:after="0"/>
             </w:pPr>
-            <w:hyperlink w:history="1" r:id="rIdnvumepubrsbpv_jfvbm4f">
+            <w:hyperlink w:history="1" r:id="rIdmyhbsfbzy3-hz8bhryosx">
               <w:r>
                 <w:rPr>
                   <w:u w:val="single"/>
@@ -23622,7 +23804,7 @@
             <w:pPr>
               <w:spacing w:before="0" w:after="0"/>
             </w:pPr>
-            <w:hyperlink w:history="1" r:id="rIdootayu0zarxepycb9tbeu">
+            <w:hyperlink w:history="1" r:id="rIdcvxp2us24gg3g5drhjosz">
               <w:r>
                 <w:rPr>
                   <w:u w:val="single"/>
@@ -23739,7 +23921,7 @@
             <w:pPr>
               <w:spacing w:before="0" w:after="0"/>
             </w:pPr>
-            <w:hyperlink w:history="1" r:id="rIdnoo61ougthq-uruhzoe9l">
+            <w:hyperlink w:history="1" r:id="rIdapggzldd90ptvq-poxzhb">
               <w:r>
                 <w:rPr>
                   <w:u w:val="single"/>
@@ -23896,7 +24078,7 @@
             <w:pPr>
               <w:spacing w:before="0" w:after="0"/>
             </w:pPr>
-            <w:hyperlink w:history="1" r:id="rIdku06sy1jziowtw7hb-hsn">
+            <w:hyperlink w:history="1" r:id="rIdvnqrc0gl2ah3ju6d2apxg">
               <w:r>
                 <w:rPr>
                   <w:u w:val="single"/>
@@ -24013,7 +24195,7 @@
             <w:pPr>
               <w:spacing w:before="0" w:after="0"/>
             </w:pPr>
-            <w:hyperlink w:history="1" r:id="rIdwxaynm_f-2-u44ffhsfdy">
+            <w:hyperlink w:history="1" r:id="rIdlsqw14tctwwlw10dt0hrn">
               <w:r>
                 <w:rPr>
                   <w:u w:val="single"/>
@@ -24130,7 +24312,7 @@
             <w:pPr>
               <w:spacing w:before="0" w:after="0"/>
             </w:pPr>
-            <w:hyperlink w:history="1" r:id="rIdpibue2khlqxqhcstb2h0s">
+            <w:hyperlink w:history="1" r:id="rIdfrbr8i40-rsnpjba-4doq">
               <w:r>
                 <w:rPr>
                   <w:u w:val="single"/>
@@ -24287,7 +24469,7 @@
             <w:pPr>
               <w:spacing w:before="0" w:after="0"/>
             </w:pPr>
-            <w:hyperlink w:history="1" r:id="rIdeiy-6gwodfefnme64zyth">
+            <w:hyperlink w:history="1" r:id="rIdkengnwlofk4fmtzp2mewj">
               <w:r>
                 <w:rPr>
                   <w:u w:val="single"/>
@@ -24404,7 +24586,7 @@
             <w:pPr>
               <w:spacing w:before="0" w:after="0"/>
             </w:pPr>
-            <w:hyperlink w:history="1" r:id="rIdaqvdtv8g9zdzaswdruirv">
+            <w:hyperlink w:history="1" r:id="rIdnmvv7wlffdniiopkfaod9">
               <w:r>
                 <w:rPr>
                   <w:u w:val="single"/>
@@ -24521,7 +24703,7 @@
             <w:pPr>
               <w:spacing w:before="0" w:after="0"/>
             </w:pPr>
-            <w:hyperlink w:history="1" r:id="rIdj0x5ziehsetm0gnbv6lmj">
+            <w:hyperlink w:history="1" r:id="rIdomfpfuob2ynyoi23wzjmg">
               <w:r>
                 <w:rPr>
                   <w:u w:val="single"/>
@@ -24638,7 +24820,7 @@
             <w:pPr>
               <w:spacing w:before="0" w:after="0"/>
             </w:pPr>
-            <w:hyperlink w:history="1" r:id="rIdvfti114wfhnff6_p21ywc">
+            <w:hyperlink w:history="1" r:id="rIdxpgumjkfixxc8mkrlani0">
               <w:r>
                 <w:rPr>
                   <w:u w:val="single"/>
@@ -24795,7 +24977,7 @@
             <w:pPr>
               <w:spacing w:before="0" w:after="0"/>
             </w:pPr>
-            <w:hyperlink w:history="1" r:id="rIdgomm9fd07nfliuslhgfrd">
+            <w:hyperlink w:history="1" r:id="rIdxh8j1o3cnfatnqsguvae9">
               <w:r>
                 <w:rPr>
                   <w:u w:val="single"/>
@@ -24912,7 +25094,7 @@
             <w:pPr>
               <w:spacing w:before="0" w:after="0"/>
             </w:pPr>
-            <w:hyperlink w:history="1" r:id="rIdegmtfnpru8wvslr4pq5js">
+            <w:hyperlink w:history="1" r:id="rIdx5bagdnwh4wkxkrk_dz8i">
               <w:r>
                 <w:rPr>
                   <w:u w:val="single"/>
@@ -25029,7 +25211,7 @@
             <w:pPr>
               <w:spacing w:before="0" w:after="0"/>
             </w:pPr>
-            <w:hyperlink w:history="1" r:id="rId3apqvldq2sq2775jn3dls">
+            <w:hyperlink w:history="1" r:id="rIdnsyeseqs5pmdsdgozdjxf">
               <w:r>
                 <w:rPr>
                   <w:u w:val="single"/>
@@ -25186,7 +25368,7 @@
             <w:pPr>
               <w:spacing w:before="0" w:after="0"/>
             </w:pPr>
-            <w:hyperlink w:history="1" r:id="rIdk2bhrnsiaohjpxfazapkc">
+            <w:hyperlink w:history="1" r:id="rIdf94bvbehpprgrpi5e3y5z">
               <w:r>
                 <w:rPr>
                   <w:u w:val="single"/>
@@ -25303,7 +25485,7 @@
             <w:pPr>
               <w:spacing w:before="0" w:after="0"/>
             </w:pPr>
-            <w:hyperlink w:history="1" r:id="rId_9i4iulame_j0dr6letrr">
+            <w:hyperlink w:history="1" r:id="rIdcadxkipnx96852a1p4ob1">
               <w:r>
                 <w:rPr>
                   <w:u w:val="single"/>
@@ -25420,7 +25602,7 @@
             <w:pPr>
               <w:spacing w:before="0" w:after="0"/>
             </w:pPr>
-            <w:hyperlink w:history="1" r:id="rIdskioo-fuymlgtczrzgnkq">
+            <w:hyperlink w:history="1" r:id="rIdgtt_2vduf13mnmjjkwjok">
               <w:r>
                 <w:rPr>
                   <w:u w:val="single"/>
@@ -25537,7 +25719,7 @@
             <w:pPr>
               <w:spacing w:before="0" w:after="0"/>
             </w:pPr>
-            <w:hyperlink w:history="1" r:id="rIdosjztgso2wdmjsvgbk2b9">
+            <w:hyperlink w:history="1" r:id="rIdnlkhnmpkhcwnfdqae-kqn">
               <w:r>
                 <w:rPr>
                   <w:u w:val="single"/>
@@ -25694,7 +25876,7 @@
             <w:pPr>
               <w:spacing w:before="0" w:after="0"/>
             </w:pPr>
-            <w:hyperlink w:history="1" r:id="rIda2k8xvtrzhfr2yhaeurfy">
+            <w:hyperlink w:history="1" r:id="rIds__wnmvo59bfyr8bf3aqs">
               <w:r>
                 <w:rPr>
                   <w:u w:val="single"/>
@@ -25811,7 +25993,7 @@
             <w:pPr>
               <w:spacing w:before="0" w:after="0"/>
             </w:pPr>
-            <w:hyperlink w:history="1" r:id="rIdjkiiv-uoicpqfbm4rchyb">
+            <w:hyperlink w:history="1" r:id="rIdaudspkkdfy0zwji4ar6nq">
               <w:r>
                 <w:rPr>
                   <w:u w:val="single"/>
@@ -25928,7 +26110,7 @@
             <w:pPr>
               <w:spacing w:before="0" w:after="0"/>
             </w:pPr>
-            <w:hyperlink w:history="1" r:id="rIduhuc6njrphlv9feybtgns">
+            <w:hyperlink w:history="1" r:id="rIdpcdrpzkzj9ohpygdke_vb">
               <w:r>
                 <w:rPr>
                   <w:u w:val="single"/>
@@ -26045,7 +26227,7 @@
             <w:pPr>
               <w:spacing w:before="0" w:after="0"/>
             </w:pPr>
-            <w:hyperlink w:history="1" r:id="rIdijphbjodq9mj743mcj0cd">
+            <w:hyperlink w:history="1" r:id="rIdpgccrbocxfpzft7z46de9">
               <w:r>
                 <w:rPr>
                   <w:u w:val="single"/>
@@ -26162,7 +26344,7 @@
             <w:pPr>
               <w:spacing w:before="0" w:after="0"/>
             </w:pPr>
-            <w:hyperlink w:history="1" r:id="rIdltaq1lkvo8v4yd09vqzfl">
+            <w:hyperlink w:history="1" r:id="rIdqszzs6uprbx-m2lydnxbw">
               <w:r>
                 <w:rPr>
                   <w:u w:val="single"/>
@@ -26279,7 +26461,7 @@
             <w:pPr>
               <w:spacing w:before="0" w:after="0"/>
             </w:pPr>
-            <w:hyperlink w:history="1" r:id="rIdtueq-e1jmoypg24rtfhrc">
+            <w:hyperlink w:history="1" r:id="rIdjhycss76klbwomvkc6jre">
               <w:r>
                 <w:rPr>
                   <w:u w:val="single"/>
@@ -26396,7 +26578,7 @@
             <w:pPr>
               <w:spacing w:before="0" w:after="0"/>
             </w:pPr>
-            <w:hyperlink w:history="1" r:id="rIdpbqoq5vcne8arzzubbdyy">
+            <w:hyperlink w:history="1" r:id="rIdx9orzhlans5apxhkaguak">
               <w:r>
                 <w:rPr>
                   <w:u w:val="single"/>
@@ -26513,7 +26695,7 @@
             <w:pPr>
               <w:spacing w:before="0" w:after="0"/>
             </w:pPr>
-            <w:hyperlink w:history="1" r:id="rIdn0__l0c3x7oeeqhkj2lbc">
+            <w:hyperlink w:history="1" r:id="rIdsksowkly33vcpvfx51wca">
               <w:r>
                 <w:rPr>
                   <w:u w:val="single"/>
@@ -26630,7 +26812,7 @@
             <w:pPr>
               <w:spacing w:before="0" w:after="0"/>
             </w:pPr>
-            <w:hyperlink w:history="1" r:id="rId632mavdbq_g3h72l-r2f7">
+            <w:hyperlink w:history="1" r:id="rIdqewgjs67tm8mqgm9gimy9">
               <w:r>
                 <w:rPr>
                   <w:u w:val="single"/>
@@ -26747,7 +26929,7 @@
             <w:pPr>
               <w:spacing w:before="0" w:after="0"/>
             </w:pPr>
-            <w:hyperlink w:history="1" r:id="rIdqjl0drljrkp_obb5cztye">
+            <w:hyperlink w:history="1" r:id="rIdcldgjnd0bngi1q4dspono">
               <w:r>
                 <w:rPr>
                   <w:u w:val="single"/>
@@ -26822,7 +27004,7 @@
         </w:rPr>
         <w:t xml:space="preserve">Corbettmaths — Properties of 3D Shapes (PDF)  --  </w:t>
       </w:r>
-      <w:hyperlink w:history="1" r:id="rId7or2cl1pv0z4eruz-uumy">
+      <w:hyperlink w:history="1" r:id="rIdwpn1cxhnwi0cwarpd74w5">
         <w:r>
           <w:rPr>
             <w:u w:val="single"/>
@@ -26856,7 +27038,7 @@
         </w:rPr>
         <w:t xml:space="preserve">Corbettmaths — Place Value (PDF)  --  </w:t>
       </w:r>
-      <w:hyperlink w:history="1" r:id="rIdwnkaguec_ts6ttqx7gzsx">
+      <w:hyperlink w:history="1" r:id="rIdfipsvqyax_au96i6upp6o">
         <w:r>
           <w:rPr>
             <w:u w:val="single"/>
@@ -26890,7 +27072,7 @@
         </w:rPr>
         <w:t xml:space="preserve">Corbettmaths — Metric Units (PDF)  --  </w:t>
       </w:r>
-      <w:hyperlink w:history="1" r:id="rIdwbgqeglqgjxc_hxczlaxp">
+      <w:hyperlink w:history="1" r:id="rIdhz_aelgrp5sp7prqbfg1m">
         <w:r>
           <w:rPr>
             <w:u w:val="single"/>
@@ -26924,7 +27106,7 @@
         </w:rPr>
         <w:t xml:space="preserve">Corbettmaths — Nets (PDF, print and fold)  --  </w:t>
       </w:r>
-      <w:hyperlink w:history="1" r:id="rIdeo5cqci2cureg6xqva5h0">
+      <w:hyperlink w:history="1" r:id="rId4silmiqfop8vt7i0bseio">
         <w:r>
           <w:rPr>
             <w:u w:val="single"/>
@@ -26958,7 +27140,7 @@
         </w:rPr>
         <w:t xml:space="preserve">Corbettmaths — Views and Elevations (PDF)  --  </w:t>
       </w:r>
-      <w:hyperlink w:history="1" r:id="rIdz2jix1t514xmlya7o6usx">
+      <w:hyperlink w:history="1" r:id="rIdkgyqethpnigblusgdfxsd">
         <w:r>
           <w:rPr>
             <w:u w:val="single"/>
@@ -26992,7 +27174,7 @@
         </w:rPr>
         <w:t xml:space="preserve">Corbettmaths — Reading Scales (PDF)  --  </w:t>
       </w:r>
-      <w:hyperlink w:history="1" r:id="rIdcyumowfajm90eyhyihi8w">
+      <w:hyperlink w:history="1" r:id="rIdliv97jkdlkx3j7_6u9vhh">
         <w:r>
           <w:rPr>
             <w:u w:val="single"/>
@@ -27026,7 +27208,7 @@
         </w:rPr>
         <w:t xml:space="preserve">Corbettmaths — Volume of a Prism (PDF)  --  </w:t>
       </w:r>
-      <w:hyperlink w:history="1" r:id="rIdo2mk0t05dzsx70ukytmta">
+      <w:hyperlink w:history="1" r:id="rIdtozco5a41ouqwtqq8trqb">
         <w:r>
           <w:rPr>
             <w:u w:val="single"/>
@@ -27060,7 +27242,7 @@
         </w:rPr>
         <w:t xml:space="preserve">Corbettmaths — Volume of a Cuboid (PDF)  --  </w:t>
       </w:r>
-      <w:hyperlink w:history="1" r:id="rIdcwbjkpocskk1e9kovsp0g">
+      <w:hyperlink w:history="1" r:id="rIdb6ygcribqbkmilw7nbieu">
         <w:r>
           <w:rPr>
             <w:u w:val="single"/>

</xml_diff>